<commit_message>
Restore bold-prefix + normal-body structure in two Results paragraphs
While propagating numbers into manuscript .docx files, the paragraph-
rewrite helper inherited runs[0]'s formatting. In the Results paragraphs
of CRC_Abstract.docx and CRC_Manuscript_Complete.docx, runs[0] was the
bold 'Results:' / 'Results.' prefix, so the entire body inherited bold
styling.

Reconstructed each paragraph with the correct two-run structure: bold
prefix + normal body. CRC_Manuscript_Complete also re-italicizes the
four species names (Parvimonas micra, Peptostreptococcus stomatis,
Gemella morbillorum, Fusobacterium nucleatum) inline.
</commit_message>
<xml_diff>
--- a/manuscript/CRC_Abstract.docx
+++ b/manuscript/CRC_Abstract.docx
@@ -78,20 +78,17 @@
       </w:pPr>
       <w:r>
         <w:rPr>
-          <w:rFonts w:ascii="Times New Roman" w:cs="Times New Roman" w:eastAsia="Times New Roman" w:hAnsi="Times New Roman"/>
           <w:b/>
-          <w:bCs/>
-          <w:sz w:val="24"/>
-          <w:szCs w:val="24"/>
-        </w:rPr>
-        <w:t>Results: The species-only RF achieved a pooled AUC of 0.810 (95% CI: 0.776 to 0.841), significantly outperforming the joint RF (AUC 0.776, 95% CI: 0.740 to 0.811; DeLong z = 2.88, p = 0.004) and joint XGBoost (AUC 0.781, 95% CI: 0.746 to 0.816; z = 2.65, p = 0.008). This advantage was stable across random seeds (AUC 0.805 +/- 0.002), pathway filter thresholds (joint RF AUC 0.773 to 0.811 across a 20-cell prevalence x mean grid; 0.773 to 0.789 excluding the degenerate mean &gt;= 1e-3 column), and confounder adjustment for age, sex, and BMI.</w:t>
-      </w:r>
-      <w:r>
-        <w:rPr>
-          <w:rFonts w:ascii="Times New Roman" w:cs="Times New Roman" w:eastAsia="Times New Roman" w:hAnsi="Times New Roman"/>
-          <w:sz w:val="24"/>
-          <w:szCs w:val="24"/>
-        </w:rPr>
+          <w:i w:val="0"/>
+        </w:rPr>
+        <w:t xml:space="preserve">Results: </w:t>
+      </w:r>
+      <w:r>
+        <w:rPr>
+          <w:b w:val="0"/>
+          <w:i w:val="0"/>
+        </w:rPr>
+        <w:t>The species-only RF achieved a pooled AUC of 0.810 (95% CI: 0.776 to 0.841), significantly outperforming the joint RF (AUC 0.776, 95% CI: 0.740 to 0.811; DeLong z = 2.88, p = 0.004) and joint XGBoost (AUC 0.781, 95% CI: 0.746 to 0.816; z = 2.65, p = 0.008). This advantage was stable across random seeds (AUC 0.805 +/- 0.002), pathway filter thresholds (joint RF AUC 0.773 to 0.811 across a 20-cell prevalence x mean grid; 0.773 to 0.789 excluding the degenerate mean &gt;= 1e-3 column), and confounder adjustment for age, sex, and BMI.</w:t>
       </w:r>
     </w:p>
     <w:p>

</xml_diff>

<commit_message>
Restore bold-prefix + normal-body structure in two Results paragraphs While propagating numbers into manuscript .docx files, the paragraph- rewrite helper inherited runs[0]'s formatting. In the Results paragraphs of CRC_Abstract.docx and CRC_Manuscript_Complete.docx, runs[0] was the bold 'Results:' / 'Results.' prefix, so the entire body inherited bold styling. Reconstructed each paragraph with the correct two-run structure: bold prefix + normal body. CRC_Manuscript_Complete also re-italicizes the four species names (Parvimonas micra, Peptostreptococcus stomatis, Gemella morbillorum, Fusobacterium nucleatum) inline.
</commit_message>
<xml_diff>
--- a/manuscript/CRC_Abstract.docx
+++ b/manuscript/CRC_Abstract.docx
@@ -78,20 +78,17 @@
       </w:pPr>
       <w:r>
         <w:rPr>
-          <w:rFonts w:ascii="Times New Roman" w:cs="Times New Roman" w:eastAsia="Times New Roman" w:hAnsi="Times New Roman"/>
           <w:b/>
-          <w:bCs/>
-          <w:sz w:val="24"/>
-          <w:szCs w:val="24"/>
-        </w:rPr>
-        <w:t>Results: The species-only RF achieved a pooled AUC of 0.810 (95% CI: 0.776 to 0.841), significantly outperforming the joint RF (AUC 0.776, 95% CI: 0.740 to 0.811; DeLong z = 2.88, p = 0.004) and joint XGBoost (AUC 0.781, 95% CI: 0.746 to 0.816; z = 2.65, p = 0.008). This advantage was stable across random seeds (AUC 0.805 +/- 0.002), pathway filter thresholds (joint RF AUC 0.773 to 0.811 across a 20-cell prevalence x mean grid; 0.773 to 0.789 excluding the degenerate mean &gt;= 1e-3 column), and confounder adjustment for age, sex, and BMI.</w:t>
-      </w:r>
-      <w:r>
-        <w:rPr>
-          <w:rFonts w:ascii="Times New Roman" w:cs="Times New Roman" w:eastAsia="Times New Roman" w:hAnsi="Times New Roman"/>
-          <w:sz w:val="24"/>
-          <w:szCs w:val="24"/>
-        </w:rPr>
+          <w:i w:val="0"/>
+        </w:rPr>
+        <w:t xml:space="preserve">Results: </w:t>
+      </w:r>
+      <w:r>
+        <w:rPr>
+          <w:b w:val="0"/>
+          <w:i w:val="0"/>
+        </w:rPr>
+        <w:t>The species-only RF achieved a pooled AUC of 0.810 (95% CI: 0.776 to 0.841), significantly outperforming the joint RF (AUC 0.776, 95% CI: 0.740 to 0.811; DeLong z = 2.88, p = 0.004) and joint XGBoost (AUC 0.781, 95% CI: 0.746 to 0.816; z = 2.65, p = 0.008). This advantage was stable across random seeds (AUC 0.805 +/- 0.002), pathway filter thresholds (joint RF AUC 0.773 to 0.811 across a 20-cell prevalence x mean grid; 0.773 to 0.789 excluding the degenerate mean &gt;= 1e-3 column), and confounder adjustment for age, sex, and BMI.</w:t>
       </w:r>
     </w:p>
     <w:p>

</xml_diff>